<commit_message>
Use generic wording instead of social-network brand names
</commit_message>
<xml_diff>
--- a/Docs/Darviq-Buzz_HLD_v1.0.docx
+++ b/Docs/Darviq-Buzz_HLD_v1.0.docx
@@ -24,9 +24,9 @@
         <w:rPr>
           <w:sz w:val="30"/>
         </w:rPr>
-        <w:t>Darviq-Buzz: A Facebook-like Social Platform Built as a</w:t>
+        <w:t>Darviq-Buzz: A Social Platform Built as</w:t>
         <w:br/>
-        <w:t>Microservices Practice Platform</w:t>
+        <w:t>Microservices</w:t>
       </w:r>
     </w:p>
     <w:p>
@@ -4995,7 +4995,7 @@
     </w:p>
     <w:p>
       <w:r>
-        <w:t>engagement-service supports 6 reaction types on a post (matching real Facebook-style engagement rather than a single generic "like"): like, love, haha, wow, sad, angry.</w:t>
+        <w:t>engagement-service supports 6 reaction types on a post (richer than a single generic "like"): like, love, haha, wow, sad, angry.</w:t>
       </w:r>
     </w:p>
     <w:p>
@@ -5230,6 +5230,9 @@
     </w:tbl>
     <w:sectPr>
       <w:footerReference w:type="default" r:id="rId9"/>
+      <w:headerReference w:type="default" r:id="rId12"/>
+      <w:headerReference w:type="first" r:id="rId13"/>
+      <w:footerReference w:type="first" r:id="rId14"/>
       <w:pgSz w:w="12240" w:h="15840"/>
       <w:pgMar w:top="1134" w:right="1247" w:bottom="1134" w:left="1247" w:header="720" w:footer="720" w:gutter="0"/>
       <w:cols w:space="720"/>
@@ -5253,6 +5256,36 @@
     </w:r>
   </w:p>
 </w:ftr>
+</file>
+
+<file path=word/footer2.xml><?xml version="1.0" encoding="utf-8"?>
+<w:ftr xmlns:m="http://schemas.openxmlformats.org/officeDocument/2006/math" xmlns:mc="http://schemas.openxmlformats.org/markup-compatibility/2006" xmlns:mo="http://schemas.microsoft.com/office/mac/office/2008/main" xmlns:mv="urn:schemas-microsoft-com:mac:vml" xmlns:o="urn:schemas-microsoft-com:office:office" xmlns:r="http://schemas.openxmlformats.org/officeDocument/2006/relationships" xmlns:v="urn:schemas-microsoft-com:vml" xmlns:w10="urn:schemas-microsoft-com:office:word" xmlns:w14="http://schemas.microsoft.com/office/word/2010/wordml" xmlns:w="http://schemas.openxmlformats.org/wordprocessingml/2006/main" xmlns:wne="http://schemas.microsoft.com/office/word/2006/wordml" xmlns:wp14="http://schemas.microsoft.com/office/word/2010/wordprocessingDrawing" xmlns:wp="http://schemas.openxmlformats.org/drawingml/2006/wordprocessingDrawing" xmlns:wpc="http://schemas.microsoft.com/office/word/2010/wordprocessingCanvas" xmlns:wpg="http://schemas.microsoft.com/office/word/2010/wordprocessingGroup" xmlns:wpi="http://schemas.microsoft.com/office/word/2010/wordprocessingInk" xmlns:wps="http://schemas.microsoft.com/office/word/2010/wordprocessingShape" mc:Ignorable="w14 wp14">
+  <w:p>
+    <w:pPr>
+      <w:pStyle w:val="Footer"/>
+    </w:pPr>
+  </w:p>
+</w:ftr>
+</file>
+
+<file path=word/header1.xml><?xml version="1.0" encoding="utf-8"?>
+<w:hdr xmlns:m="http://schemas.openxmlformats.org/officeDocument/2006/math" xmlns:mc="http://schemas.openxmlformats.org/markup-compatibility/2006" xmlns:mo="http://schemas.microsoft.com/office/mac/office/2008/main" xmlns:mv="urn:schemas-microsoft-com:mac:vml" xmlns:o="urn:schemas-microsoft-com:office:office" xmlns:r="http://schemas.openxmlformats.org/officeDocument/2006/relationships" xmlns:v="urn:schemas-microsoft-com:vml" xmlns:w10="urn:schemas-microsoft-com:office:word" xmlns:w14="http://schemas.microsoft.com/office/word/2010/wordml" xmlns:w="http://schemas.openxmlformats.org/wordprocessingml/2006/main" xmlns:wne="http://schemas.microsoft.com/office/word/2006/wordml" xmlns:wp14="http://schemas.microsoft.com/office/word/2010/wordprocessingDrawing" xmlns:wp="http://schemas.openxmlformats.org/drawingml/2006/wordprocessingDrawing" xmlns:wpc="http://schemas.microsoft.com/office/word/2010/wordprocessingCanvas" xmlns:wpg="http://schemas.microsoft.com/office/word/2010/wordprocessingGroup" xmlns:wpi="http://schemas.microsoft.com/office/word/2010/wordprocessingInk" xmlns:wps="http://schemas.microsoft.com/office/word/2010/wordprocessingShape" mc:Ignorable="w14 wp14">
+  <w:p>
+    <w:pPr>
+      <w:pStyle w:val="Header"/>
+    </w:pPr>
+  </w:p>
+</w:hdr>
+</file>
+
+<file path=word/header2.xml><?xml version="1.0" encoding="utf-8"?>
+<w:hdr xmlns:m="http://schemas.openxmlformats.org/officeDocument/2006/math" xmlns:mc="http://schemas.openxmlformats.org/markup-compatibility/2006" xmlns:mo="http://schemas.microsoft.com/office/mac/office/2008/main" xmlns:mv="urn:schemas-microsoft-com:mac:vml" xmlns:o="urn:schemas-microsoft-com:office:office" xmlns:r="http://schemas.openxmlformats.org/officeDocument/2006/relationships" xmlns:v="urn:schemas-microsoft-com:vml" xmlns:w10="urn:schemas-microsoft-com:office:word" xmlns:w14="http://schemas.microsoft.com/office/word/2010/wordml" xmlns:w="http://schemas.openxmlformats.org/wordprocessingml/2006/main" xmlns:wne="http://schemas.microsoft.com/office/word/2006/wordml" xmlns:wp14="http://schemas.microsoft.com/office/word/2010/wordprocessingDrawing" xmlns:wp="http://schemas.openxmlformats.org/drawingml/2006/wordprocessingDrawing" xmlns:wpc="http://schemas.microsoft.com/office/word/2010/wordprocessingCanvas" xmlns:wpg="http://schemas.microsoft.com/office/word/2010/wordprocessingGroup" xmlns:wpi="http://schemas.microsoft.com/office/word/2010/wordprocessingInk" xmlns:wps="http://schemas.microsoft.com/office/word/2010/wordprocessingShape" mc:Ignorable="w14 wp14">
+  <w:p>
+    <w:pPr>
+      <w:pStyle w:val="Header"/>
+    </w:pPr>
+  </w:p>
+</w:hdr>
 </file>
 
 <file path=word/numbering.xml><?xml version="1.0" encoding="utf-8"?>

</xml_diff>

<commit_message>
HLD: describe Buzz as a reference architecture
</commit_message>
<xml_diff>
--- a/Docs/Darviq-Buzz_HLD_v1.0.docx
+++ b/Docs/Darviq-Buzz_HLD_v1.0.docx
@@ -125,7 +125,7 @@
               <w:rPr>
                 <w:sz w:val="19"/>
               </w:rPr>
-              <w:t>Portfolio / DevOps-SRE Practice Platform</w:t>
+              <w:t>Reference architecture</w:t>
             </w:r>
           </w:p>
         </w:tc>
@@ -1601,7 +1601,7 @@
     </w:p>
     <w:p>
       <w:r>
-        <w:t>Darviq-Buzz is an 11-service microservices application built as a deliberate practice platform for polyglot persistence, event-driven architecture, and observability -- not merely "a working app." PostgreSQL backs the three services that need ad hoc filtering and simple read-after-write consistency on modest tables (users, notifications, media); Apache Cassandra backs the six services with genuinely partition-friendly, high-write social data (social graph, posts, engagement, stories, messaging, feed). RabbitMQ decouples the write path from its side effects: creating a post does not block on fanning it out to every follower's feed or notifying anyone who reacts to it.</w:t>
+        <w:t>Darviq-Buzz is an 11-service microservices application built to demonstrate polyglot persistence, event-driven architecture, and observability -- not merely "a working app." PostgreSQL backs the three services that need ad hoc filtering and simple read-after-write consistency on modest tables (users, notifications, media); Apache Cassandra backs the six services with genuinely partition-friendly, high-write social data (social graph, posts, engagement, stories, messaging, feed). RabbitMQ decouples the write path from its side effects: creating a post does not block on fanning it out to every follower's feed or notifying anyone who reacts to it.</w:t>
       </w:r>
     </w:p>
     <w:p>
@@ -1678,7 +1678,7 @@
         <w:pStyle w:val="ListBullet"/>
       </w:pPr>
       <w:r>
-        <w:t>Multi-region or multi-cluster deployment -- out of scope for a homelab practice platform.</w:t>
+        <w:t>Multi-region or multi-cluster deployment -- out of scope for this version.</w:t>
       </w:r>
     </w:p>
     <w:p>

</xml_diff>